<commit_message>
Close out neural-prior audit item with full-resolution 3-seed test (v22)
Calibration and a 500-step diagnostic showed the network's quality
peaks early then collapses to a stable lower plateau under continued
training at full resolution -- a genuine, repeatable effect across
learning rates, not noise. The full 3-seed comparison tracks each
seed's best-ever checkpoint (the fairest possible reading) and finds it
still falls short of GS's own converged baseline, let alone SGD's --
confirming the original small-scale finding and closing the last open
item from v20/v21's audit.

Also includes v21 with tables converted to charts for readability.

Co-Authored-By: Claude Sonnet 5 <noreply@anthropic.com>
</commit_message>
<xml_diff>
--- a/AR_Glasses_Technical_Reference_v21.docx
+++ b/AR_Glasses_Technical_Reference_v21.docx
@@ -50,7 +50,7 @@
           <w:sz w:val="20"/>
           <w:szCs w:val="20"/>
         </w:rPr>
-        <w:t>v21 · Condensed for external readability — no new findings this revision. Every number is unchanged from v20; only the framing changed. Section 10 and the Closing Note previously narrated which revision (v13, v15, v17, v20) caught which error — that revision-by-revision history now lives in Appendix A only. The main body states each current finding directly.</w:t>
+        <w:t>v21 · Condensed for external readability — no new findings this revision. Every number is unchanged from v20; only the framing changed. Section 10 and the Closing Note previously narrated which revision (v13, v15, v17, v20) caught which error — that revision-by-revision history now lives in Appendix A only. The main body states each current finding directly. This pass also replaces several dense Section 10 tables with the plots the underlying experiments already produce (10.3, 10.4, 10.7, 10.8 — the exact figures stay in the matching Appendix A entry), and adds a plot beside a few tables whose per-seed or per-condition figures aren't otherwise duplicated (10.1, 10.6, A.14.2, A.14.5, A.14.6).</w:t>
       </w:r>
     </w:p>
     <w:p>
@@ -4027,6 +4027,57 @@
     </w:p>
     <w:p>
       <w:pPr>
+        <w:jc w:val="center"/>
+      </w:pPr>
+      <w:r>
+        <w:drawing>
+          <wp:inline xmlns:a="http://schemas.openxmlformats.org/drawingml/2006/main" xmlns:pic="http://schemas.openxmlformats.org/drawingml/2006/picture">
+            <wp:extent cx="5486400" cy="3048000"/>
+            <wp:docPr id="1" name="Picture 1"/>
+            <wp:cNvGraphicFramePr>
+              <a:graphicFrameLocks noChangeAspect="1"/>
+            </wp:cNvGraphicFramePr>
+            <a:graphic>
+              <a:graphicData uri="http://schemas.openxmlformats.org/drawingml/2006/picture">
+                <pic:pic>
+                  <pic:nvPicPr>
+                    <pic:cNvPr id="0" name="end_to_end_seed_check.png"/>
+                    <pic:cNvPicPr/>
+                  </pic:nvPicPr>
+                  <pic:blipFill>
+                    <a:blip r:embed="rId8"/>
+                    <a:stretch>
+                      <a:fillRect/>
+                    </a:stretch>
+                  </pic:blipFill>
+                  <pic:spPr>
+                    <a:xfrm>
+                      <a:off x="0" y="0"/>
+                      <a:ext cx="5486400" cy="3048000"/>
+                    </a:xfrm>
+                    <a:prstGeom prst="rect"/>
+                  </pic:spPr>
+                </pic:pic>
+              </a:graphicData>
+            </a:graphic>
+          </wp:inline>
+        </w:drawing>
+      </w:r>
+    </w:p>
+    <w:p>
+      <w:pPr>
+        <w:jc w:val="center"/>
+      </w:pPr>
+      <w:r>
+        <w:rPr>
+          <w:i/>
+          <w:sz w:val="18"/>
+        </w:rPr>
+        <w:t>Convergence curves for all 5 seeds, full resolution, real content (mean PSNR across planes vs. iteration). Same run as the table above: final quality converges to a tight band while the iteration at which each seed gets there varies widely — the source of the 30–65 iteration spread.</w:t>
+      </w:r>
+    </w:p>
+    <w:p>
+      <w:pPr>
         <w:pStyle w:val="Heading2"/>
         <w:spacing w:after="150" w:before="300"/>
       </w:pPr>
@@ -4152,293 +4203,57 @@
         <w:t>Confirmed across 25 independent seed pairings at full resolution — every pairing positive, for every plane:</w:t>
       </w:r>
     </w:p>
-    <w:tbl>
-      <w:tblPr>
-        <w:tblW w:type="dxa" w:w="9000"/>
-        <w:tblBorders>
-          <w:top w:val="single" w:color="auto" w:sz="4"/>
-          <w:left w:val="single" w:color="auto" w:sz="4"/>
-          <w:bottom w:val="single" w:color="auto" w:sz="4"/>
-          <w:right w:val="single" w:color="auto" w:sz="4"/>
-          <w:insideH w:val="single" w:color="auto" w:sz="4"/>
-          <w:insideV w:val="single" w:color="auto" w:sz="4"/>
-        </w:tblBorders>
-      </w:tblPr>
-      <w:tblGrid>
-        <w:gridCol w:w="1800"/>
-        <w:gridCol w:w="2000"/>
-        <w:gridCol w:w="2000"/>
-        <w:gridCol w:w="2700"/>
-      </w:tblGrid>
-      <w:tr>
-        <w:tc>
-          <w:tcPr>
-            <w:tcW w:type="dxa" w:w="1800"/>
-            <w:shd w:fill="F2F2F2" w:val="clear"/>
-          </w:tcPr>
-          <w:p>
-            <w:r>
-              <w:rPr>
-                <w:b/>
-                <w:bCs/>
-                <w:sz w:val="20"/>
-                <w:szCs w:val="20"/>
-              </w:rPr>
-              <w:t xml:space="preserve">Plane</w:t>
-            </w:r>
-          </w:p>
-        </w:tc>
-        <w:tc>
-          <w:tcPr>
-            <w:tcW w:type="dxa" w:w="2000"/>
-            <w:shd w:fill="F2F2F2" w:val="clear"/>
-          </w:tcPr>
-          <w:p>
-            <w:r>
-              <w:rPr>
-                <w:b/>
-                <w:bCs/>
-                <w:sz w:val="20"/>
-                <w:szCs w:val="20"/>
-              </w:rPr>
-              <w:t xml:space="preserve">Simultaneous avg</w:t>
-            </w:r>
-          </w:p>
-        </w:tc>
-        <w:tc>
-          <w:tcPr>
-            <w:tcW w:type="dxa" w:w="2000"/>
-            <w:shd w:fill="F2F2F2" w:val="clear"/>
-          </w:tcPr>
-          <w:p>
-            <w:r>
-              <w:rPr>
-                <w:b/>
-                <w:bCs/>
-                <w:sz w:val="20"/>
-                <w:szCs w:val="20"/>
-              </w:rPr>
-              <w:t xml:space="preserve">Sequential avg</w:t>
-            </w:r>
-          </w:p>
-        </w:tc>
-        <w:tc>
-          <w:tcPr>
-            <w:tcW w:type="dxa" w:w="2700"/>
-            <w:shd w:fill="F2F2F2" w:val="clear"/>
-          </w:tcPr>
-          <w:p>
-            <w:r>
-              <w:rPr>
-                <w:b/>
-                <w:bCs/>
-                <w:sz w:val="20"/>
-                <w:szCs w:val="20"/>
-              </w:rPr>
-              <w:t xml:space="preserve">Delta range across 25 seed pairings</w:t>
-            </w:r>
-          </w:p>
-        </w:tc>
-      </w:tr>
-      <w:tr>
-        <w:tc>
-          <w:tcPr>
-            <w:tcW w:type="dxa" w:w="1800"/>
-          </w:tcPr>
-          <w:p>
-            <w:r>
-              <w:rPr>
-                <w:b w:val="false"/>
-                <w:bCs w:val="false"/>
-                <w:sz w:val="20"/>
-                <w:szCs w:val="20"/>
-              </w:rPr>
-              <w:t xml:space="preserve">Near (sparse)</w:t>
-            </w:r>
-          </w:p>
-        </w:tc>
-        <w:tc>
-          <w:tcPr>
-            <w:tcW w:type="dxa" w:w="2000"/>
-          </w:tcPr>
-          <w:p>
-            <w:r>
-              <w:rPr>
-                <w:b w:val="false"/>
-                <w:bCs w:val="false"/>
-                <w:sz w:val="20"/>
-                <w:szCs w:val="20"/>
-              </w:rPr>
-              <w:t xml:space="preserve">7.47</w:t>
-            </w:r>
-          </w:p>
-        </w:tc>
-        <w:tc>
-          <w:tcPr>
-            <w:tcW w:type="dxa" w:w="2000"/>
-          </w:tcPr>
-          <w:p>
-            <w:r>
-              <w:rPr>
-                <w:b w:val="false"/>
-                <w:bCs w:val="false"/>
-                <w:sz w:val="20"/>
-                <w:szCs w:val="20"/>
-              </w:rPr>
-              <w:t xml:space="preserve">8.79</w:t>
-            </w:r>
-          </w:p>
-        </w:tc>
-        <w:tc>
-          <w:tcPr>
-            <w:tcW w:type="dxa" w:w="2700"/>
-          </w:tcPr>
-          <w:p>
-            <w:r>
-              <w:rPr>
-                <w:b w:val="false"/>
-                <w:bCs w:val="false"/>
-                <w:sz w:val="20"/>
-                <w:szCs w:val="20"/>
-              </w:rPr>
-              <w:t xml:space="preserve">+0.87 to +2.06 dB</w:t>
-            </w:r>
-          </w:p>
-        </w:tc>
-      </w:tr>
-      <w:tr>
-        <w:tc>
-          <w:tcPr>
-            <w:tcW w:type="dxa" w:w="1800"/>
-          </w:tcPr>
-          <w:p>
-            <w:r>
-              <w:rPr>
-                <w:b w:val="false"/>
-                <w:bCs w:val="false"/>
-                <w:sz w:val="20"/>
-                <w:szCs w:val="20"/>
-              </w:rPr>
-              <w:t xml:space="preserve">Mid (sparse)</w:t>
-            </w:r>
-          </w:p>
-        </w:tc>
-        <w:tc>
-          <w:tcPr>
-            <w:tcW w:type="dxa" w:w="2000"/>
-          </w:tcPr>
-          <w:p>
-            <w:r>
-              <w:rPr>
-                <w:b w:val="false"/>
-                <w:bCs w:val="false"/>
-                <w:sz w:val="20"/>
-                <w:szCs w:val="20"/>
-              </w:rPr>
-              <w:t xml:space="preserve">10.53</w:t>
-            </w:r>
-          </w:p>
-        </w:tc>
-        <w:tc>
-          <w:tcPr>
-            <w:tcW w:type="dxa" w:w="2000"/>
-          </w:tcPr>
-          <w:p>
-            <w:r>
-              <w:rPr>
-                <w:b w:val="false"/>
-                <w:bCs w:val="false"/>
-                <w:sz w:val="20"/>
-                <w:szCs w:val="20"/>
-              </w:rPr>
-              <w:t xml:space="preserve">11.21</w:t>
-            </w:r>
-          </w:p>
-        </w:tc>
-        <w:tc>
-          <w:tcPr>
-            <w:tcW w:type="dxa" w:w="2700"/>
-          </w:tcPr>
-          <w:p>
-            <w:r>
-              <w:rPr>
-                <w:b w:val="false"/>
-                <w:bCs w:val="false"/>
-                <w:sz w:val="20"/>
-                <w:szCs w:val="20"/>
-              </w:rPr>
-              <w:t xml:space="preserve">+0.30 to +1.21 dB</w:t>
-            </w:r>
-          </w:p>
-        </w:tc>
-      </w:tr>
-      <w:tr>
-        <w:tc>
-          <w:tcPr>
-            <w:tcW w:type="dxa" w:w="1800"/>
-          </w:tcPr>
-          <w:p>
-            <w:r>
-              <w:rPr>
-                <w:b w:val="false"/>
-                <w:bCs w:val="false"/>
-                <w:sz w:val="20"/>
-                <w:szCs w:val="20"/>
-              </w:rPr>
-              <w:t xml:space="preserve">Far (dense)</w:t>
-            </w:r>
-          </w:p>
-        </w:tc>
-        <w:tc>
-          <w:tcPr>
-            <w:tcW w:type="dxa" w:w="2000"/>
-          </w:tcPr>
-          <w:p>
-            <w:r>
-              <w:rPr>
-                <w:b w:val="false"/>
-                <w:bCs w:val="false"/>
-                <w:sz w:val="20"/>
-                <w:szCs w:val="20"/>
-              </w:rPr>
-              <w:t xml:space="preserve">11.23</w:t>
-            </w:r>
-          </w:p>
-        </w:tc>
-        <w:tc>
-          <w:tcPr>
-            <w:tcW w:type="dxa" w:w="2000"/>
-          </w:tcPr>
-          <w:p>
-            <w:r>
-              <w:rPr>
-                <w:b w:val="false"/>
-                <w:bCs w:val="false"/>
-                <w:sz w:val="20"/>
-                <w:szCs w:val="20"/>
-              </w:rPr>
-              <w:t xml:space="preserve">14.70</w:t>
-            </w:r>
-          </w:p>
-        </w:tc>
-        <w:tc>
-          <w:tcPr>
-            <w:tcW w:type="dxa" w:w="2700"/>
-          </w:tcPr>
-          <w:p>
-            <w:r>
-              <w:rPr>
-                <w:b w:val="false"/>
-                <w:bCs w:val="false"/>
-                <w:sz w:val="20"/>
-                <w:szCs w:val="20"/>
-              </w:rPr>
-              <w:t xml:space="preserve">+2.81 to +4.42 dB</w:t>
-            </w:r>
-          </w:p>
-        </w:tc>
-      </w:tr>
-    </w:tbl>
+    <w:p>
+      <w:pPr>
+        <w:jc w:val="center"/>
+      </w:pPr>
+      <w:r>
+        <w:drawing>
+          <wp:inline xmlns:a="http://schemas.openxmlformats.org/drawingml/2006/main" xmlns:pic="http://schemas.openxmlformats.org/drawingml/2006/picture">
+            <wp:extent cx="5486400" cy="1463040"/>
+            <wp:docPr id="2" name="Picture 2"/>
+            <wp:cNvGraphicFramePr>
+              <a:graphicFrameLocks noChangeAspect="1"/>
+            </wp:cNvGraphicFramePr>
+            <a:graphic>
+              <a:graphicData uri="http://schemas.openxmlformats.org/drawingml/2006/picture">
+                <pic:pic>
+                  <pic:nvPicPr>
+                    <pic:cNvPr id="0" name="seq_vs_sim_seed_check.png"/>
+                    <pic:cNvPicPr/>
+                  </pic:nvPicPr>
+                  <pic:blipFill>
+                    <a:blip r:embed="rId9"/>
+                    <a:stretch>
+                      <a:fillRect/>
+                    </a:stretch>
+                  </pic:blipFill>
+                  <pic:spPr>
+                    <a:xfrm>
+                      <a:off x="0" y="0"/>
+                      <a:ext cx="5486400" cy="1463040"/>
+                    </a:xfrm>
+                    <a:prstGeom prst="rect"/>
+                  </pic:spPr>
+                </pic:pic>
+              </a:graphicData>
+            </a:graphic>
+          </wp:inline>
+        </w:drawing>
+      </w:r>
+    </w:p>
+    <w:p>
+      <w:pPr>
+        <w:jc w:val="center"/>
+      </w:pPr>
+      <w:r>
+        <w:rPr>
+          <w:i/>
+          <w:sz w:val="18"/>
+        </w:rPr>
+        <w:t>Per-seed PSNR behind the 25 seed-pairing comparison, by depth plane. Every sequential-seed value sits above every simultaneous-seed value in each plane — the basis for the “never crosses zero” finding.</w:t>
+      </w:r>
+    </w:p>
     <w:p>
       <w:pPr>
         <w:spacing w:after="200"/>
@@ -4506,209 +4321,57 @@
         <w:t>A phase pattern solved for one wavelength does not fully transfer to others. At full target resolution, run to true convergence and averaged across 3 seeds, across all three depth planes, corrected metric:</w:t>
       </w:r>
     </w:p>
-    <w:tbl>
-      <w:tblPr>
-        <w:tblW w:type="dxa" w:w="9000"/>
-        <w:tblBorders>
-          <w:top w:val="single" w:color="auto" w:sz="4"/>
-          <w:left w:val="single" w:color="auto" w:sz="4"/>
-          <w:bottom w:val="single" w:color="auto" w:sz="4"/>
-          <w:right w:val="single" w:color="auto" w:sz="4"/>
-          <w:insideH w:val="single" w:color="auto" w:sz="4"/>
-          <w:insideV w:val="single" w:color="auto" w:sz="4"/>
-        </w:tblBorders>
-      </w:tblPr>
-      <w:tblGrid>
-        <w:gridCol w:w="3200"/>
-        <w:gridCol w:w="2800"/>
-        <w:gridCol w:w="3000"/>
-      </w:tblGrid>
-      <w:tr>
-        <w:tc>
-          <w:tcPr>
-            <w:tcW w:type="dxa" w:w="3200"/>
-            <w:shd w:fill="F2F2F2" w:val="clear"/>
-          </w:tcPr>
-          <w:p>
-            <w:r>
-              <w:rPr>
-                <w:b/>
-                <w:bCs/>
-                <w:sz w:val="20"/>
-                <w:szCs w:val="20"/>
-              </w:rPr>
-              <w:t xml:space="preserve">Approach</w:t>
-            </w:r>
-          </w:p>
-        </w:tc>
-        <w:tc>
-          <w:tcPr>
-            <w:tcW w:type="dxa" w:w="2800"/>
-            <w:shd w:fill="F2F2F2" w:val="clear"/>
-          </w:tcPr>
-          <w:p>
-            <w:r>
-              <w:rPr>
-                <w:b/>
-                <w:bCs/>
-                <w:sz w:val="20"/>
-                <w:szCs w:val="20"/>
-              </w:rPr>
-              <w:t xml:space="preserve">Quality (avg. red+blue)</w:t>
-            </w:r>
-          </w:p>
-        </w:tc>
-        <w:tc>
-          <w:tcPr>
-            <w:tcW w:type="dxa" w:w="3000"/>
-            <w:shd w:fill="F2F2F2" w:val="clear"/>
-          </w:tcPr>
-          <w:p>
-            <w:r>
-              <w:rPr>
-                <w:b/>
-                <w:bCs/>
-                <w:sz w:val="20"/>
-                <w:szCs w:val="20"/>
-              </w:rPr>
-              <w:t xml:space="preserve">Cost</w:t>
-            </w:r>
-          </w:p>
-        </w:tc>
-      </w:tr>
-      <w:tr>
-        <w:tc>
-          <w:tcPr>
-            <w:tcW w:type="dxa" w:w="3200"/>
-          </w:tcPr>
-          <w:p>
-            <w:r>
-              <w:rPr>
-                <w:b w:val="false"/>
-                <w:bCs w:val="false"/>
-                <w:sz w:val="20"/>
-                <w:szCs w:val="20"/>
-              </w:rPr>
-              <w:t xml:space="preserve">Native (separate solve per color)</w:t>
-            </w:r>
-          </w:p>
-        </w:tc>
-        <w:tc>
-          <w:tcPr>
-            <w:tcW w:type="dxa" w:w="2800"/>
-          </w:tcPr>
-          <w:p>
-            <w:r>
-              <w:t>9.97 dB</w:t>
-            </w:r>
-          </w:p>
-        </w:tc>
-        <w:tc>
-          <w:tcPr>
-            <w:tcW w:type="dxa" w:w="3000"/>
-          </w:tcPr>
-          <w:p>
-            <w:r>
-              <w:rPr>
-                <w:b w:val="false"/>
-                <w:bCs w:val="false"/>
-                <w:sz w:val="20"/>
-                <w:szCs w:val="20"/>
-              </w:rPr>
-              <w:t xml:space="preserve">3 sub-frames — matches HOLOEYE GAEA-2.1's Color Field Sequential practice</w:t>
-            </w:r>
-          </w:p>
-        </w:tc>
-      </w:tr>
-      <w:tr>
-        <w:tc>
-          <w:tcPr>
-            <w:tcW w:type="dxa" w:w="3200"/>
-          </w:tcPr>
-          <w:p>
-            <w:r>
-              <w:rPr>
-                <w:b w:val="false"/>
-                <w:bCs w:val="false"/>
-                <w:sz w:val="20"/>
-                <w:szCs w:val="20"/>
-              </w:rPr>
-              <w:t xml:space="preserve">Naive reuse (green phase, unmodified)</w:t>
-            </w:r>
-          </w:p>
-        </w:tc>
-        <w:tc>
-          <w:tcPr>
-            <w:tcW w:type="dxa" w:w="2800"/>
-          </w:tcPr>
-          <w:p>
-            <w:r>
-              <w:t>6.97 dB (−3.00 dB)</w:t>
-            </w:r>
-          </w:p>
-        </w:tc>
-        <w:tc>
-          <w:tcPr>
-            <w:tcW w:type="dxa" w:w="3000"/>
-          </w:tcPr>
-          <w:p>
-            <w:r>
-              <w:rPr>
-                <w:b w:val="false"/>
-                <w:bCs w:val="false"/>
-                <w:sz w:val="20"/>
-                <w:szCs w:val="20"/>
-              </w:rPr>
-              <w:t xml:space="preserve">1 sub-frame — effectively free</w:t>
-            </w:r>
-          </w:p>
-        </w:tc>
-      </w:tr>
-      <w:tr>
-        <w:tc>
-          <w:tcPr>
-            <w:tcW w:type="dxa" w:w="3200"/>
-          </w:tcPr>
-          <w:p>
-            <w:r>
-              <w:rPr>
-                <w:b w:val="false"/>
-                <w:bCs w:val="false"/>
-                <w:sz w:val="20"/>
-                <w:szCs w:val="20"/>
-              </w:rPr>
-              <w:t xml:space="preserve">Joint (single pattern, 9 constraints at once)</w:t>
-            </w:r>
-          </w:p>
-        </w:tc>
-        <w:tc>
-          <w:tcPr>
-            <w:tcW w:type="dxa" w:w="2800"/>
-          </w:tcPr>
-          <w:p>
-            <w:r>
-              <w:t>8.33 dB (−1.64 dB short of native)</w:t>
-            </w:r>
-          </w:p>
-        </w:tc>
-        <w:tc>
-          <w:tcPr>
-            <w:tcW w:type="dxa" w:w="3000"/>
-          </w:tcPr>
-          <w:p>
-            <w:r>
-              <w:rPr>
-                <w:b w:val="false"/>
-                <w:bCs w:val="false"/>
-                <w:sz w:val="20"/>
-                <w:szCs w:val="20"/>
-              </w:rPr>
-              <w:t xml:space="preserve">1 sub-frame at same total FFT cost as native — proposed design point, not commercially observed</w:t>
-            </w:r>
-          </w:p>
-        </w:tc>
-      </w:tr>
-    </w:tbl>
+    <w:p>
+      <w:pPr>
+        <w:jc w:val="center"/>
+      </w:pPr>
+      <w:r>
+        <w:drawing>
+          <wp:inline xmlns:a="http://schemas.openxmlformats.org/drawingml/2006/main" xmlns:pic="http://schemas.openxmlformats.org/drawingml/2006/picture">
+            <wp:extent cx="5486400" cy="3429000"/>
+            <wp:docPr id="3" name="Picture 3"/>
+            <wp:cNvGraphicFramePr>
+              <a:graphicFrameLocks noChangeAspect="1"/>
+            </wp:cNvGraphicFramePr>
+            <a:graphic>
+              <a:graphicData uri="http://schemas.openxmlformats.org/drawingml/2006/picture">
+                <pic:pic>
+                  <pic:nvPicPr>
+                    <pic:cNvPr id="0" name="color_seed_check.png"/>
+                    <pic:cNvPicPr/>
+                  </pic:nvPicPr>
+                  <pic:blipFill>
+                    <a:blip r:embed="rId10"/>
+                    <a:stretch>
+                      <a:fillRect/>
+                    </a:stretch>
+                  </pic:blipFill>
+                  <pic:spPr>
+                    <a:xfrm>
+                      <a:off x="0" y="0"/>
+                      <a:ext cx="5486400" cy="3429000"/>
+                    </a:xfrm>
+                    <a:prstGeom prst="rect"/>
+                  </pic:spPr>
+                </pic:pic>
+              </a:graphicData>
+            </a:graphic>
+          </wp:inline>
+        </w:drawing>
+      </w:r>
+    </w:p>
+    <w:p>
+      <w:pPr>
+        <w:jc w:val="center"/>
+      </w:pPr>
+      <w:r>
+        <w:rPr>
+          <w:i/>
+          <w:sz w:val="18"/>
+        </w:rPr>
+        <w:t>Per-seed PSNR by color approach, true convergence, full resolution (error bars = min–max across 3 seeds). Native's own spread is wide — joint sits inside it, naive reuse clearly below both.</w:t>
+      </w:r>
+    </w:p>
     <w:p>
       <w:pPr>
         <w:spacing w:after="200"/>
@@ -6518,6 +6181,57 @@
     </w:p>
     <w:p>
       <w:pPr>
+        <w:jc w:val="center"/>
+      </w:pPr>
+      <w:r>
+        <w:drawing>
+          <wp:inline xmlns:a="http://schemas.openxmlformats.org/drawingml/2006/main" xmlns:pic="http://schemas.openxmlformats.org/drawingml/2006/picture">
+            <wp:extent cx="5486400" cy="3429000"/>
+            <wp:docPr id="4" name="Picture 4"/>
+            <wp:cNvGraphicFramePr>
+              <a:graphicFrameLocks noChangeAspect="1"/>
+            </wp:cNvGraphicFramePr>
+            <a:graphic>
+              <a:graphicData uri="http://schemas.openxmlformats.org/drawingml/2006/picture">
+                <pic:pic>
+                  <pic:nvPicPr>
+                    <pic:cNvPr id="0" name="int8_precision_fullres_converged.png"/>
+                    <pic:cNvPicPr/>
+                  </pic:nvPicPr>
+                  <pic:blipFill>
+                    <a:blip r:embed="rId11"/>
+                    <a:stretch>
+                      <a:fillRect/>
+                    </a:stretch>
+                  </pic:blipFill>
+                  <pic:spPr>
+                    <a:xfrm>
+                      <a:off x="0" y="0"/>
+                      <a:ext cx="5486400" cy="3429000"/>
+                    </a:xfrm>
+                    <a:prstGeom prst="rect"/>
+                  </pic:spPr>
+                </pic:pic>
+              </a:graphicData>
+            </a:graphic>
+          </wp:inline>
+        </w:drawing>
+      </w:r>
+    </w:p>
+    <w:p>
+      <w:pPr>
+        <w:jc w:val="center"/>
+      </w:pPr>
+      <w:r>
+        <w:rPr>
+          <w:i/>
+          <w:sz w:val="18"/>
+        </w:rPr>
+        <w:t>Quality vs. bit depth at true convergence, full resolution, per depth plane and averaged. The flat average line from 8 bits on is the 8-bit/float32 equivalence finding; 4-bit's drop across all three planes is the coarser-quantization degradation.</w:t>
+      </w:r>
+    </w:p>
+    <w:p>
+      <w:pPr>
         <w:pStyle w:val="Heading2"/>
         <w:spacing w:after="150" w:before="300"/>
       </w:pPr>
@@ -7009,227 +6723,108 @@
         <w:t>Rerun to true, verified convergence on both sides, the result reverses:</w:t>
       </w:r>
     </w:p>
-    <w:tbl>
-      <w:tblPr>
-        <w:tblW w:type="dxa" w:w="9000"/>
-        <w:tblBorders>
-          <w:top w:val="single" w:color="auto" w:sz="4"/>
-          <w:left w:val="single" w:color="auto" w:sz="4"/>
-          <w:bottom w:val="single" w:color="auto" w:sz="4"/>
-          <w:right w:val="single" w:color="auto" w:sz="4"/>
-          <w:insideH w:val="single" w:color="auto" w:sz="4"/>
-          <w:insideV w:val="single" w:color="auto" w:sz="4"/>
-        </w:tblBorders>
-      </w:tblPr>
-      <w:tblGrid>
-        <w:gridCol w:w="3200"/>
-        <w:gridCol w:w="2600"/>
-        <w:gridCol w:w="2600"/>
-        <w:gridCol w:w="3600"/>
-      </w:tblGrid>
-      <w:tr>
-        <w:tc>
-          <w:tcPr>
-            <w:tcW w:type="dxa" w:w="3200"/>
-            <w:shd w:fill="F2F2F2" w:val="clear"/>
-          </w:tcPr>
-          <w:p>
-            <w:r>
-              <w:rPr>
-                <w:b/>
-                <w:bCs/>
-                <w:sz w:val="20"/>
-                <w:szCs w:val="20"/>
-              </w:rPr>
-              <w:t xml:space="preserve">Direction</w:t>
-            </w:r>
-          </w:p>
-        </w:tc>
-        <w:tc>
-          <w:tcPr>
-            <w:tcW w:type="dxa" w:w="2600"/>
-            <w:shd w:fill="F2F2F2" w:val="clear"/>
-          </w:tcPr>
-          <w:p>
-            <w:r>
-              <w:rPr>
-                <w:b/>
-                <w:bCs/>
-                <w:sz w:val="20"/>
-                <w:szCs w:val="20"/>
-              </w:rPr>
-              <w:t xml:space="preserve">Random avg iters (true convergence)</w:t>
-            </w:r>
-          </w:p>
-        </w:tc>
-        <w:tc>
-          <w:tcPr>
-            <w:tcW w:type="dxa" w:w="2600"/>
-            <w:shd w:fill="F2F2F2" w:val="clear"/>
-          </w:tcPr>
-          <w:p>
-            <w:r>
-              <w:rPr>
-                <w:b/>
-                <w:bCs/>
-                <w:sz w:val="20"/>
-                <w:szCs w:val="20"/>
-              </w:rPr>
-              <w:t xml:space="preserve">Donor avg iters (true convergence)</w:t>
-            </w:r>
-          </w:p>
-        </w:tc>
-        <w:tc>
-          <w:tcPr>
-            <w:tcW w:type="dxa" w:w="3600"/>
-            <w:shd w:fill="F2F2F2" w:val="clear"/>
-          </w:tcPr>
-          <w:p>
-            <w:r>
-              <w:rPr>
-                <w:b/>
-                <w:bCs/>
-                <w:sz w:val="20"/>
-                <w:szCs w:val="20"/>
-              </w:rPr>
-              <w:t xml:space="preserve">Real effect</w:t>
-            </w:r>
-          </w:p>
-        </w:tc>
-      </w:tr>
-      <w:tr>
-        <w:tc>
-          <w:tcPr>
-            <w:tcW w:type="dxa" w:w="3200"/>
-          </w:tcPr>
-          <w:p>
-            <w:r>
-              <w:rPr>
-                <w:b w:val="false"/>
-                <w:bCs w:val="false"/>
-                <w:sz w:val="20"/>
-                <w:szCs w:val="20"/>
-              </w:rPr>
-              <w:t xml:space="preserve">A: realistic donor → synthetic target</w:t>
-            </w:r>
-          </w:p>
-        </w:tc>
-        <w:tc>
-          <w:tcPr>
-            <w:tcW w:type="dxa" w:w="2600"/>
-          </w:tcPr>
-          <w:p>
-            <w:r>
-              <w:rPr>
-                <w:b w:val="false"/>
-                <w:bCs w:val="false"/>
-                <w:sz w:val="20"/>
-                <w:szCs w:val="20"/>
-              </w:rPr>
-              <w:t xml:space="preserve">40.2 (11.18 dB)</w:t>
-            </w:r>
-          </w:p>
-        </w:tc>
-        <w:tc>
-          <w:tcPr>
-            <w:tcW w:type="dxa" w:w="2600"/>
-          </w:tcPr>
-          <w:p>
-            <w:r>
-              <w:rPr>
-                <w:b w:val="false"/>
-                <w:bCs w:val="false"/>
-                <w:sz w:val="20"/>
-                <w:szCs w:val="20"/>
-              </w:rPr>
-              <w:t xml:space="preserve">41.5 (11.19 dB)</w:t>
-            </w:r>
-          </w:p>
-        </w:tc>
-        <w:tc>
-          <w:tcPr>
-            <w:tcW w:type="dxa" w:w="3600"/>
-          </w:tcPr>
-          <w:p>
-            <w:r>
-              <w:rPr>
-                <w:b w:val="false"/>
-                <w:bCs w:val="false"/>
-                <w:sz w:val="20"/>
-                <w:szCs w:val="20"/>
-              </w:rPr>
-              <w:t xml:space="preserve">None — the 24% speedup was entirely a budget artifact</w:t>
-            </w:r>
-          </w:p>
-        </w:tc>
-      </w:tr>
-      <w:tr>
-        <w:tc>
-          <w:tcPr>
-            <w:tcW w:type="dxa" w:w="3200"/>
-          </w:tcPr>
-          <w:p>
-            <w:r>
-              <w:rPr>
-                <w:b w:val="false"/>
-                <w:bCs w:val="false"/>
-                <w:sz w:val="20"/>
-                <w:szCs w:val="20"/>
-              </w:rPr>
-              <w:t xml:space="preserve">B: synthetic donor → realistic target</w:t>
-            </w:r>
-          </w:p>
-        </w:tc>
-        <w:tc>
-          <w:tcPr>
-            <w:tcW w:type="dxa" w:w="2600"/>
-          </w:tcPr>
-          <w:p>
-            <w:r>
-              <w:rPr>
-                <w:b w:val="false"/>
-                <w:bCs w:val="false"/>
-                <w:sz w:val="20"/>
-                <w:szCs w:val="20"/>
-              </w:rPr>
-              <w:t xml:space="preserve">94.2 (12.08 dB)</w:t>
-            </w:r>
-          </w:p>
-        </w:tc>
-        <w:tc>
-          <w:tcPr>
-            <w:tcW w:type="dxa" w:w="2600"/>
-          </w:tcPr>
-          <w:p>
-            <w:r>
-              <w:rPr>
-                <w:b w:val="false"/>
-                <w:bCs w:val="false"/>
-                <w:sz w:val="20"/>
-                <w:szCs w:val="20"/>
-              </w:rPr>
-              <w:t xml:space="preserve">108.7 (11.90 dB)</w:t>
-            </w:r>
-          </w:p>
-        </w:tc>
-        <w:tc>
-          <w:tcPr>
-            <w:tcW w:type="dxa" w:w="3600"/>
-          </w:tcPr>
-          <w:p>
-            <w:r>
-              <w:rPr>
-                <w:b w:val="false"/>
-                <w:bCs w:val="false"/>
-                <w:sz w:val="20"/>
-                <w:szCs w:val="20"/>
-              </w:rPr>
-              <w:t xml:space="preserve">Reversed — donor-seeding needs 15% more iterations and costs ~0.18 dB, not a win at all</w:t>
-            </w:r>
-          </w:p>
-        </w:tc>
-      </w:tr>
-    </w:tbl>
+    <w:p>
+      <w:pPr>
+        <w:jc w:val="center"/>
+      </w:pPr>
+      <w:r>
+        <w:drawing>
+          <wp:inline xmlns:a="http://schemas.openxmlformats.org/drawingml/2006/main" xmlns:pic="http://schemas.openxmlformats.org/drawingml/2006/picture">
+            <wp:extent cx="5486400" cy="3291840"/>
+            <wp:docPr id="5" name="Picture 5"/>
+            <wp:cNvGraphicFramePr>
+              <a:graphicFrameLocks noChangeAspect="1"/>
+            </wp:cNvGraphicFramePr>
+            <a:graphic>
+              <a:graphicData uri="http://schemas.openxmlformats.org/drawingml/2006/picture">
+                <pic:pic>
+                  <pic:nvPicPr>
+                    <pic:cNvPr id="0" name="crosssession_directionA_longrun.png"/>
+                    <pic:cNvPicPr/>
+                  </pic:nvPicPr>
+                  <pic:blipFill>
+                    <a:blip r:embed="rId12"/>
+                    <a:stretch>
+                      <a:fillRect/>
+                    </a:stretch>
+                  </pic:blipFill>
+                  <pic:spPr>
+                    <a:xfrm>
+                      <a:off x="0" y="0"/>
+                      <a:ext cx="5486400" cy="3291840"/>
+                    </a:xfrm>
+                    <a:prstGeom prst="rect"/>
+                  </pic:spPr>
+                </pic:pic>
+              </a:graphicData>
+            </a:graphic>
+          </wp:inline>
+        </w:drawing>
+      </w:r>
+    </w:p>
+    <w:p>
+      <w:pPr>
+        <w:jc w:val="center"/>
+      </w:pPr>
+      <w:r>
+        <w:rPr>
+          <w:i/>
+          <w:sz w:val="18"/>
+        </w:rPr>
+        <w:t>Direction A (realistic donor → synthetic target), true convergence, 200 iterations: random-init and donor-seeded runs interleave with no consistent separation — no real effect.</w:t>
+      </w:r>
+    </w:p>
+    <w:p>
+      <w:pPr>
+        <w:jc w:val="center"/>
+      </w:pPr>
+      <w:r>
+        <w:drawing>
+          <wp:inline xmlns:a="http://schemas.openxmlformats.org/drawingml/2006/main" xmlns:pic="http://schemas.openxmlformats.org/drawingml/2006/picture">
+            <wp:extent cx="5486400" cy="3291840"/>
+            <wp:docPr id="6" name="Picture 6"/>
+            <wp:cNvGraphicFramePr>
+              <a:graphicFrameLocks noChangeAspect="1"/>
+            </wp:cNvGraphicFramePr>
+            <a:graphic>
+              <a:graphicData uri="http://schemas.openxmlformats.org/drawingml/2006/picture">
+                <pic:pic>
+                  <pic:nvPicPr>
+                    <pic:cNvPr id="0" name="crosssession_directionB_longrun.png"/>
+                    <pic:cNvPicPr/>
+                  </pic:nvPicPr>
+                  <pic:blipFill>
+                    <a:blip r:embed="rId13"/>
+                    <a:stretch>
+                      <a:fillRect/>
+                    </a:stretch>
+                  </pic:blipFill>
+                  <pic:spPr>
+                    <a:xfrm>
+                      <a:off x="0" y="0"/>
+                      <a:ext cx="5486400" cy="3291840"/>
+                    </a:xfrm>
+                    <a:prstGeom prst="rect"/>
+                  </pic:spPr>
+                </pic:pic>
+              </a:graphicData>
+            </a:graphic>
+          </wp:inline>
+        </w:drawing>
+      </w:r>
+    </w:p>
+    <w:p>
+      <w:pPr>
+        <w:jc w:val="center"/>
+      </w:pPr>
+      <w:r>
+        <w:rPr>
+          <w:i/>
+          <w:sz w:val="18"/>
+        </w:rPr>
+        <w:t>Direction B (synthetic donor → realistic target), true convergence, 200 iterations: random-init (blue) settles higher than donor-seeded (green) — the reversal from the fixed-budget result above.</w:t>
+      </w:r>
+    </w:p>
     <w:p>
       <w:pPr>
         <w:spacing w:after="200"/>
@@ -7297,327 +6892,57 @@
         <w:t>Tested across two content profiles differing in how much is happening at the middle depth: CLOSEUP (sparse mid content) and LAYERED (dense mid content). Both propagate the 2-plane (near/far only) solution to the dropped mid depth and compare against the real mid target, the 3-plane baseline's ceiling, and a blank floor:</w:t>
       </w:r>
     </w:p>
-    <w:tbl>
-      <w:tblPr>
-        <w:tblW w:type="dxa" w:w="9000"/>
-        <w:tblBorders>
-          <w:top w:val="single" w:color="auto" w:sz="4"/>
-          <w:left w:val="single" w:color="auto" w:sz="4"/>
-          <w:bottom w:val="single" w:color="auto" w:sz="4"/>
-          <w:right w:val="single" w:color="auto" w:sz="4"/>
-          <w:insideH w:val="single" w:color="auto" w:sz="4"/>
-          <w:insideV w:val="single" w:color="auto" w:sz="4"/>
-        </w:tblBorders>
-      </w:tblPr>
-      <w:tblGrid>
-        <w:gridCol w:w="2400"/>
-        <w:gridCol w:w="1600"/>
-        <w:gridCol w:w="2400"/>
-        <w:gridCol w:w="1600"/>
-        <w:gridCol w:w="1600"/>
-        <w:gridCol w:w="1400"/>
-      </w:tblGrid>
-      <w:tr>
-        <w:tc>
-          <w:tcPr>
-            <w:tcW w:type="dxa" w:w="2400"/>
-            <w:shd w:fill="F2F2F2" w:val="clear"/>
-          </w:tcPr>
-          <w:p>
-            <w:r>
-              <w:rPr>
-                <w:b/>
-                <w:bCs/>
-                <w:sz w:val="20"/>
-                <w:szCs w:val="20"/>
-              </w:rPr>
-              <w:t xml:space="preserve">Profile</w:t>
-            </w:r>
-          </w:p>
-        </w:tc>
-        <w:tc>
-          <w:tcPr>
-            <w:tcW w:type="dxa" w:w="1600"/>
-            <w:shd w:fill="F2F2F2" w:val="clear"/>
-          </w:tcPr>
-          <w:p>
-            <w:r>
-              <w:rPr>
-                <w:b/>
-                <w:bCs/>
-                <w:sz w:val="20"/>
-                <w:szCs w:val="20"/>
-              </w:rPr>
-              <w:t xml:space="preserve">Ceiling (3-plane)</w:t>
-            </w:r>
-          </w:p>
-        </w:tc>
-        <w:tc>
-          <w:tcPr>
-            <w:tcW w:type="dxa" w:w="2400"/>
-            <w:shd w:fill="F2F2F2" w:val="clear"/>
-          </w:tcPr>
-          <w:p>
-            <w:r>
-              <w:rPr>
-                <w:b/>
-                <w:bCs/>
-                <w:sz w:val="20"/>
-                <w:szCs w:val="20"/>
-              </w:rPr>
-              <w:t xml:space="preserve">Proxy (2-plane, unsolicited)</w:t>
-            </w:r>
-          </w:p>
-        </w:tc>
-        <w:tc>
-          <w:tcPr>
-            <w:tcW w:type="dxa" w:w="1600"/>
-            <w:shd w:fill="F2F2F2" w:val="clear"/>
-          </w:tcPr>
-          <w:p>
-            <w:r>
-              <w:rPr>
-                <w:b/>
-                <w:bCs/>
-                <w:sz w:val="20"/>
-                <w:szCs w:val="20"/>
-              </w:rPr>
-              <w:t xml:space="preserve">Floor (blank)</w:t>
-            </w:r>
-          </w:p>
-        </w:tc>
-        <w:tc>
-          <w:tcPr>
-            <w:tcW w:type="dxa" w:w="1600"/>
-            <w:shd w:fill="F2F2F2" w:val="clear"/>
-          </w:tcPr>
-          <w:p>
-            <w:r>
-              <w:rPr>
-                <w:b/>
-                <w:bCs/>
-                <w:sz w:val="20"/>
-                <w:szCs w:val="20"/>
-              </w:rPr>
-              <w:t xml:space="preserve">Gap to ceiling</w:t>
-            </w:r>
-          </w:p>
-        </w:tc>
-        <w:tc>
-          <w:tcPr>
-            <w:tcW w:type="dxa" w:w="1400"/>
-            <w:shd w:fill="F2F2F2" w:val="clear"/>
-          </w:tcPr>
-          <w:p>
-            <w:r>
-              <w:rPr>
-                <w:b/>
-                <w:bCs/>
-                <w:sz w:val="20"/>
-                <w:szCs w:val="20"/>
-              </w:rPr>
-              <w:t xml:space="preserve">FFTs saved</w:t>
-            </w:r>
-          </w:p>
-        </w:tc>
-      </w:tr>
-      <w:tr>
-        <w:tc>
-          <w:tcPr>
-            <w:tcW w:type="dxa" w:w="2400"/>
-          </w:tcPr>
-          <w:p>
-            <w:r>
-              <w:rPr>
-                <w:b w:val="false"/>
-                <w:bCs w:val="false"/>
-                <w:sz w:val="20"/>
-                <w:szCs w:val="20"/>
-              </w:rPr>
-              <w:t xml:space="preserve">CLOSEUP (sparse mid)</w:t>
-            </w:r>
-          </w:p>
-        </w:tc>
-        <w:tc>
-          <w:tcPr>
-            <w:tcW w:type="dxa" w:w="1600"/>
-          </w:tcPr>
-          <w:p>
-            <w:r>
-              <w:rPr>
-                <w:b w:val="false"/>
-                <w:bCs w:val="false"/>
-                <w:sz w:val="20"/>
-                <w:szCs w:val="20"/>
-              </w:rPr>
-              <w:t xml:space="preserve">8.94 dB</w:t>
-            </w:r>
-          </w:p>
-        </w:tc>
-        <w:tc>
-          <w:tcPr>
-            <w:tcW w:type="dxa" w:w="2400"/>
-          </w:tcPr>
-          <w:p>
-            <w:r>
-              <w:rPr>
-                <w:b w:val="false"/>
-                <w:bCs w:val="false"/>
-                <w:sz w:val="20"/>
-                <w:szCs w:val="20"/>
-              </w:rPr>
-              <w:t xml:space="preserve">5.12 dB</w:t>
-            </w:r>
-          </w:p>
-        </w:tc>
-        <w:tc>
-          <w:tcPr>
-            <w:tcW w:type="dxa" w:w="1600"/>
-          </w:tcPr>
-          <w:p>
-            <w:r>
-              <w:rPr>
-                <w:b w:val="false"/>
-                <w:bCs w:val="false"/>
-                <w:sz w:val="20"/>
-                <w:szCs w:val="20"/>
-              </w:rPr>
-              <w:t xml:space="preserve">2.71 dB</w:t>
-            </w:r>
-          </w:p>
-        </w:tc>
-        <w:tc>
-          <w:tcPr>
-            <w:tcW w:type="dxa" w:w="1600"/>
-          </w:tcPr>
-          <w:p>
-            <w:r>
-              <w:rPr>
-                <w:b w:val="false"/>
-                <w:bCs w:val="false"/>
-                <w:sz w:val="20"/>
-                <w:szCs w:val="20"/>
-              </w:rPr>
-              <w:t xml:space="preserve">3.82 dB</w:t>
-            </w:r>
-          </w:p>
-        </w:tc>
-        <w:tc>
-          <w:tcPr>
-            <w:tcW w:type="dxa" w:w="1400"/>
-          </w:tcPr>
-          <w:p>
-            <w:r>
-              <w:rPr>
-                <w:b w:val="false"/>
-                <w:bCs w:val="false"/>
-                <w:sz w:val="20"/>
-                <w:szCs w:val="20"/>
-              </w:rPr>
-              <w:t xml:space="preserve">+32.9%</w:t>
-            </w:r>
-          </w:p>
-        </w:tc>
-      </w:tr>
-      <w:tr>
-        <w:tc>
-          <w:tcPr>
-            <w:tcW w:type="dxa" w:w="2400"/>
-          </w:tcPr>
-          <w:p>
-            <w:r>
-              <w:rPr>
-                <w:b w:val="false"/>
-                <w:bCs w:val="false"/>
-                <w:sz w:val="20"/>
-                <w:szCs w:val="20"/>
-              </w:rPr>
-              <w:t xml:space="preserve">LAYERED (dense mid)</w:t>
-            </w:r>
-          </w:p>
-        </w:tc>
-        <w:tc>
-          <w:tcPr>
-            <w:tcW w:type="dxa" w:w="1600"/>
-          </w:tcPr>
-          <w:p>
-            <w:r>
-              <w:rPr>
-                <w:b w:val="false"/>
-                <w:bCs w:val="false"/>
-                <w:sz w:val="20"/>
-                <w:szCs w:val="20"/>
-              </w:rPr>
-              <w:t xml:space="preserve">6.55 dB</w:t>
-            </w:r>
-          </w:p>
-        </w:tc>
-        <w:tc>
-          <w:tcPr>
-            <w:tcW w:type="dxa" w:w="2400"/>
-          </w:tcPr>
-          <w:p>
-            <w:r>
-              <w:rPr>
-                <w:b w:val="false"/>
-                <w:bCs w:val="false"/>
-                <w:sz w:val="20"/>
-                <w:szCs w:val="20"/>
-              </w:rPr>
-              <w:t xml:space="preserve">3.84 dB</w:t>
-            </w:r>
-          </w:p>
-        </w:tc>
-        <w:tc>
-          <w:tcPr>
-            <w:tcW w:type="dxa" w:w="1600"/>
-          </w:tcPr>
-          <w:p>
-            <w:r>
-              <w:rPr>
-                <w:b w:val="false"/>
-                <w:bCs w:val="false"/>
-                <w:sz w:val="20"/>
-                <w:szCs w:val="20"/>
-              </w:rPr>
-              <w:t xml:space="preserve">2.90 dB</w:t>
-            </w:r>
-          </w:p>
-        </w:tc>
-        <w:tc>
-          <w:tcPr>
-            <w:tcW w:type="dxa" w:w="1600"/>
-          </w:tcPr>
-          <w:p>
-            <w:r>
-              <w:rPr>
-                <w:b w:val="false"/>
-                <w:bCs w:val="false"/>
-                <w:sz w:val="20"/>
-                <w:szCs w:val="20"/>
-              </w:rPr>
-              <w:t xml:space="preserve">2.71 dB</w:t>
-            </w:r>
-          </w:p>
-        </w:tc>
-        <w:tc>
-          <w:tcPr>
-            <w:tcW w:type="dxa" w:w="1400"/>
-          </w:tcPr>
-          <w:p>
-            <w:r>
-              <w:rPr>
-                <w:b w:val="false"/>
-                <w:bCs w:val="false"/>
-                <w:sz w:val="20"/>
-                <w:szCs w:val="20"/>
-              </w:rPr>
-              <w:t xml:space="preserve">+20.1%</w:t>
-            </w:r>
-          </w:p>
-        </w:tc>
-      </w:tr>
-    </w:tbl>
+    <w:p>
+      <w:pPr>
+        <w:jc w:val="center"/>
+      </w:pPr>
+      <w:r>
+        <w:drawing>
+          <wp:inline xmlns:a="http://schemas.openxmlformats.org/drawingml/2006/main" xmlns:pic="http://schemas.openxmlformats.org/drawingml/2006/picture">
+            <wp:extent cx="5486400" cy="3657600"/>
+            <wp:docPr id="7" name="Picture 7"/>
+            <wp:cNvGraphicFramePr>
+              <a:graphicFrameLocks noChangeAspect="1"/>
+            </wp:cNvGraphicFramePr>
+            <a:graphic>
+              <a:graphicData uri="http://schemas.openxmlformats.org/drawingml/2006/picture">
+                <pic:pic>
+                  <pic:nvPicPr>
+                    <pic:cNvPr id="0" name="two_plane_dropoff_content_dependence.png"/>
+                    <pic:cNvPicPr/>
+                  </pic:nvPicPr>
+                  <pic:blipFill>
+                    <a:blip r:embed="rId14"/>
+                    <a:stretch>
+                      <a:fillRect/>
+                    </a:stretch>
+                  </pic:blipFill>
+                  <pic:spPr>
+                    <a:xfrm>
+                      <a:off x="0" y="0"/>
+                      <a:ext cx="5486400" cy="3657600"/>
+                    </a:xfrm>
+                    <a:prstGeom prst="rect"/>
+                  </pic:spPr>
+                </pic:pic>
+              </a:graphicData>
+            </a:graphic>
+          </wp:inline>
+        </w:drawing>
+      </w:r>
+    </w:p>
+    <w:p>
+      <w:pPr>
+        <w:jc w:val="center"/>
+      </w:pPr>
+      <w:r>
+        <w:rPr>
+          <w:i/>
+          <w:sz w:val="18"/>
+        </w:rPr>
+        <w:t>2-plane proxy vs. real mid content vs. 3-plane actual solve, both content profiles. The proxy's dB comes entirely from solving near/far — no mid-depth information is fed into it — yet CLOSEUP's proxy sits visibly closer to its target than LAYERED's, consistent with the dB gap-to-ceiling numbers.</w:t>
+      </w:r>
+    </w:p>
     <w:p>
       <w:pPr>
         <w:spacing w:after="200"/>
@@ -8182,6 +7507,11 @@
           <w:iCs w:val="false"/>
         </w:rPr>
         <w:t>The full record of what was tested, what broke, and what was fixed — organized by finding, not by revision — is preserved in Appendix A for anyone auditing or reproducing these numbers. What remains open: 10.2's plane-count figures are not yet audited against this standard, and the neural-prior comparison remains untestable at current cost (10.9).</w:t>
+      </w:r>
+    </w:p>
+    <w:p>
+      <w:r>
+        <w:t>One more change this revision, presentational rather than substantive: several Section 10 tables were replaced or supplemented with the plots the underlying experiment scripts already produce, on the reasoning that a convergence curve or a per-seed scatter communicates a variance finding faster than a table of the same numbers does. Nothing about how these results were measured changed, and every number removed from the main body remains available either in the adjacent chart, in the matching Appendix A entry, or in the repository's own output logs.</w:t>
       </w:r>
     </w:p>
     <w:p>
@@ -12598,6 +11928,57 @@
       </w:tr>
     </w:tbl>
     <w:p>
+      <w:pPr>
+        <w:jc w:val="center"/>
+      </w:pPr>
+      <w:r>
+        <w:drawing>
+          <wp:inline xmlns:a="http://schemas.openxmlformats.org/drawingml/2006/main" xmlns:pic="http://schemas.openxmlformats.org/drawingml/2006/picture">
+            <wp:extent cx="5486400" cy="3048000"/>
+            <wp:docPr id="8" name="Picture 8"/>
+            <wp:cNvGraphicFramePr>
+              <a:graphicFrameLocks noChangeAspect="1"/>
+            </wp:cNvGraphicFramePr>
+            <a:graphic>
+              <a:graphicData uri="http://schemas.openxmlformats.org/drawingml/2006/picture">
+                <pic:pic>
+                  <pic:nvPicPr>
+                    <pic:cNvPr id="0" name="lr_sweep_seed_check.png"/>
+                    <pic:cNvPicPr/>
+                  </pic:nvPicPr>
+                  <pic:blipFill>
+                    <a:blip r:embed="rId15"/>
+                    <a:stretch>
+                      <a:fillRect/>
+                    </a:stretch>
+                  </pic:blipFill>
+                  <pic:spPr>
+                    <a:xfrm>
+                      <a:off x="0" y="0"/>
+                      <a:ext cx="5486400" cy="3048000"/>
+                    </a:xfrm>
+                    <a:prstGeom prst="rect"/>
+                  </pic:spPr>
+                </pic:pic>
+              </a:graphicData>
+            </a:graphic>
+          </wp:inline>
+        </w:drawing>
+      </w:r>
+    </w:p>
+    <w:p>
+      <w:pPr>
+        <w:jc w:val="center"/>
+      </w:pPr>
+      <w:r>
+        <w:rPr>
+          <w:i/>
+          <w:sz w:val="18"/>
+        </w:rPr>
+        <w:t>All 12 runs (3 seeds × 4 strategies), full resolution. The four strategies interleave throughout training — no strategy pulls consistently ahead of the others.</w:t>
+      </w:r>
+    </w:p>
+    <w:p>
       <w:r>
         <w:rPr>
           <w:i/>
@@ -13082,6 +12463,57 @@
       </w:tr>
     </w:tbl>
     <w:p>
+      <w:pPr>
+        <w:jc w:val="center"/>
+      </w:pPr>
+      <w:r>
+        <w:drawing>
+          <wp:inline xmlns:a="http://schemas.openxmlformats.org/drawingml/2006/main" xmlns:pic="http://schemas.openxmlformats.org/drawingml/2006/picture">
+            <wp:extent cx="5486400" cy="3048000"/>
+            <wp:docPr id="9" name="Picture 9"/>
+            <wp:cNvGraphicFramePr>
+              <a:graphicFrameLocks noChangeAspect="1"/>
+            </wp:cNvGraphicFramePr>
+            <a:graphic>
+              <a:graphicData uri="http://schemas.openxmlformats.org/drawingml/2006/picture">
+                <pic:pic>
+                  <pic:nvPicPr>
+                    <pic:cNvPr id="0" name="shift_sweep_seed_check.png"/>
+                    <pic:cNvPicPr/>
+                  </pic:nvPicPr>
+                  <pic:blipFill>
+                    <a:blip r:embed="rId16"/>
+                    <a:stretch>
+                      <a:fillRect/>
+                    </a:stretch>
+                  </pic:blipFill>
+                  <pic:spPr>
+                    <a:xfrm>
+                      <a:off x="0" y="0"/>
+                      <a:ext cx="5486400" cy="3048000"/>
+                    </a:xfrm>
+                    <a:prstGeom prst="rect"/>
+                  </pic:spPr>
+                </pic:pic>
+              </a:graphicData>
+            </a:graphic>
+          </wp:inline>
+        </w:drawing>
+      </w:r>
+    </w:p>
+    <w:p>
+      <w:pPr>
+        <w:jc w:val="center"/>
+      </w:pPr>
+      <w:r>
+        <w:rPr>
+          <w:i/>
+          <w:sz w:val="18"/>
+        </w:rPr>
+        <w:t>Per-seed speedup across the full shift-magnitude sweep (512×512), with the 3-seed mean in black. The mid-sweep wobble sits well inside the per-point seed spread — not a real non-monotonic effect.</w:t>
+      </w:r>
+    </w:p>
+    <w:p>
       <w:r>
         <w:rPr>
           <w:i/>
@@ -13212,6 +12644,57 @@
         </w:tc>
       </w:tr>
     </w:tbl>
+    <w:p>
+      <w:pPr>
+        <w:jc w:val="center"/>
+      </w:pPr>
+      <w:r>
+        <w:drawing>
+          <wp:inline xmlns:a="http://schemas.openxmlformats.org/drawingml/2006/main" xmlns:pic="http://schemas.openxmlformats.org/drawingml/2006/picture">
+            <wp:extent cx="5486400" cy="1828800"/>
+            <wp:docPr id="10" name="Picture 10"/>
+            <wp:cNvGraphicFramePr>
+              <a:graphicFrameLocks noChangeAspect="1"/>
+            </wp:cNvGraphicFramePr>
+            <a:graphic>
+              <a:graphicData uri="http://schemas.openxmlformats.org/drawingml/2006/picture">
+                <pic:pic>
+                  <pic:nvPicPr>
+                    <pic:cNvPr id="0" name="two_plane_dropoff_fullres_base.png"/>
+                    <pic:cNvPicPr/>
+                  </pic:nvPicPr>
+                  <pic:blipFill>
+                    <a:blip r:embed="rId17"/>
+                    <a:stretch>
+                      <a:fillRect/>
+                    </a:stretch>
+                  </pic:blipFill>
+                  <pic:spPr>
+                    <a:xfrm>
+                      <a:off x="0" y="0"/>
+                      <a:ext cx="5486400" cy="1828800"/>
+                    </a:xfrm>
+                    <a:prstGeom prst="rect"/>
+                  </pic:spPr>
+                </pic:pic>
+              </a:graphicData>
+            </a:graphic>
+          </wp:inline>
+        </w:drawing>
+      </w:r>
+    </w:p>
+    <w:p>
+      <w:pPr>
+        <w:jc w:val="center"/>
+      </w:pPr>
+      <w:r>
+        <w:rPr>
+          <w:i/>
+          <w:sz w:val="18"/>
+        </w:rPr>
+        <w:t>Full-resolution reconstruction at the dropped mid depth, standard (non-CLOSEUP/LAYERED) content: the 2-plane proxy still resolves the caption text, just at lower contrast than the 3-plane actual solve — consistent with the quality figures, independent of the compute-side reversal.</w:t>
+      </w:r>
+    </w:p>
     <w:p>
       <w:r>
         <w:rPr>

</xml_diff>